<commit_message>
Facility Overview: apply gridlines to all three tables
The gridline pass in the previous commit died on a Python syntax error and its
output was never checked, so the committed .docx shipped with one bordered table
out of three, against Standing Rule 1b. Rerun and verified: three tables, three
bordered, page break intact.

Co-Authored-By: Claude Opus 5 <noreply@anthropic.com>
</commit_message>
<xml_diff>
--- a/Enyrgy_Facility_Overview.docx
+++ b/Enyrgy_Facility_Overview.docx
@@ -337,6 +337,14 @@
     </w:p>
     <w:tbl>
       <w:tblPr>
+        <w:tblBorders>
+          <w:top w:val="single" w:sz="4" w:space="0" w:color="auto"/>
+          <w:left w:val="single" w:sz="4" w:space="0" w:color="auto"/>
+          <w:bottom w:val="single" w:sz="4" w:space="0" w:color="auto"/>
+          <w:right w:val="single" w:sz="4" w:space="0" w:color="auto"/>
+          <w:insideH w:val="single" w:sz="4" w:space="0" w:color="auto"/>
+          <w:insideV w:val="single" w:sz="4" w:space="0" w:color="auto"/>
+        </w:tblBorders>
         <w:tblStyle w:val="Table"/>
         <w:tblW w:type="auto" w:w="0"/>
         <w:tblLook w:firstRow="1" w:lastRow="0" w:firstColumn="0" w:lastColumn="0" w:noHBand="0" w:noVBand="0" w:val="0020"/>
@@ -832,6 +840,14 @@
     </w:p>
     <w:tbl>
       <w:tblPr>
+        <w:tblBorders>
+          <w:top w:val="single" w:sz="4" w:space="0" w:color="auto"/>
+          <w:left w:val="single" w:sz="4" w:space="0" w:color="auto"/>
+          <w:bottom w:val="single" w:sz="4" w:space="0" w:color="auto"/>
+          <w:right w:val="single" w:sz="4" w:space="0" w:color="auto"/>
+          <w:insideH w:val="single" w:sz="4" w:space="0" w:color="auto"/>
+          <w:insideV w:val="single" w:sz="4" w:space="0" w:color="auto"/>
+        </w:tblBorders>
         <w:tblStyle w:val="Table"/>
         <w:tblW w:type="auto" w:w="0"/>
         <w:tblLook w:firstRow="1" w:lastRow="0" w:firstColumn="0" w:lastColumn="0" w:noHBand="0" w:noVBand="0" w:val="0020"/>

</xml_diff>